<commit_message>
fix évaluation des pairs
</commit_message>
<xml_diff>
--- a/Files/Rapport.docx
+++ b/Files/Rapport.docx
@@ -384,7 +384,7 @@
           </mc:Choice>
           <mc:Fallback>
             <w:pict>
-              <v:rect w14:anchorId="7EBE8DAC" id="Rectangle 5" o:spid="_x0000_s1026" style="width:24pt;height:24pt;visibility:visible;mso-wrap-style:square;mso-left-percent:-10001;mso-top-percent:-10001;mso-position-horizontal:absolute;mso-position-horizontal-relative:char;mso-position-vertical:absolute;mso-position-vertical-relative:line;mso-left-percent:-10001;mso-top-percent:-10001;v-text-anchor:top" o:gfxdata="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" filled="f" stroked="f">
+              <v:rect w14:anchorId="2F582304" id="Rectangle 5" o:spid="_x0000_s1026" style="width:24pt;height:24pt;visibility:visible;mso-wrap-style:square;mso-left-percent:-10001;mso-top-percent:-10001;mso-position-horizontal:absolute;mso-position-horizontal-relative:char;mso-position-vertical:absolute;mso-position-vertical-relative:line;mso-left-percent:-10001;mso-top-percent:-10001;v-text-anchor:top" o:gfxdata="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" filled="f" stroked="f">
                 <o:lock v:ext="edit" aspectratio="t"/>
                 <w10:anchorlock/>
               </v:rect>
@@ -455,7 +455,7 @@
           </mc:Choice>
           <mc:Fallback>
             <w:pict>
-              <v:rect w14:anchorId="06AFEFAF" id="Rectangle 8" o:spid="_x0000_s1026" style="width:24pt;height:24pt;visibility:visible;mso-wrap-style:square;mso-left-percent:-10001;mso-top-percent:-10001;mso-position-horizontal:absolute;mso-position-horizontal-relative:char;mso-position-vertical:absolute;mso-position-vertical-relative:line;mso-left-percent:-10001;mso-top-percent:-10001;v-text-anchor:top" o:gfxdata="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" filled="f" stroked="f">
+              <v:rect w14:anchorId="30587A8C" id="Rectangle 8" o:spid="_x0000_s1026" style="width:24pt;height:24pt;visibility:visible;mso-wrap-style:square;mso-left-percent:-10001;mso-top-percent:-10001;mso-position-horizontal:absolute;mso-position-horizontal-relative:char;mso-position-vertical:absolute;mso-position-vertical-relative:line;mso-left-percent:-10001;mso-top-percent:-10001;v-text-anchor:top" o:gfxdata="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" filled="f" stroked="f">
                 <o:lock v:ext="edit" aspectratio="t"/>
                 <w10:anchorlock/>
               </v:rect>
@@ -918,7 +918,7 @@
           </mc:Choice>
           <mc:Fallback>
             <w:pict>
-              <v:rect w14:anchorId="772A7D5B" id="Rectangle 13" o:spid="_x0000_s1026" style="width:24pt;height:24pt;visibility:visible;mso-wrap-style:square;mso-left-percent:-10001;mso-top-percent:-10001;mso-position-horizontal:absolute;mso-position-horizontal-relative:char;mso-position-vertical:absolute;mso-position-vertical-relative:line;mso-left-percent:-10001;mso-top-percent:-10001;v-text-anchor:top" o:gfxdata="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" filled="f" stroked="f">
+              <v:rect w14:anchorId="6930952A" id="Rectangle 13" o:spid="_x0000_s1026" style="width:24pt;height:24pt;visibility:visible;mso-wrap-style:square;mso-left-percent:-10001;mso-top-percent:-10001;mso-position-horizontal:absolute;mso-position-horizontal-relative:char;mso-position-vertical:absolute;mso-position-vertical-relative:line;mso-left-percent:-10001;mso-top-percent:-10001;v-text-anchor:top" o:gfxdata="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" filled="f" stroked="f">
                 <o:lock v:ext="edit" aspectratio="t"/>
                 <w10:anchorlock/>
               </v:rect>
@@ -992,7 +992,7 @@
           </mc:Choice>
           <mc:Fallback>
             <w:pict>
-              <v:rect w14:anchorId="53C8AF79" id="Rectangle 14" o:spid="_x0000_s1026" style="width:24pt;height:24pt;visibility:visible;mso-wrap-style:square;mso-left-percent:-10001;mso-top-percent:-10001;mso-position-horizontal:absolute;mso-position-horizontal-relative:char;mso-position-vertical:absolute;mso-position-vertical-relative:line;mso-left-percent:-10001;mso-top-percent:-10001;v-text-anchor:top" o:gfxdata="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" filled="f" stroked="f">
+              <v:rect w14:anchorId="0A448A7F" id="Rectangle 14" o:spid="_x0000_s1026" style="width:24pt;height:24pt;visibility:visible;mso-wrap-style:square;mso-left-percent:-10001;mso-top-percent:-10001;mso-position-horizontal:absolute;mso-position-horizontal-relative:char;mso-position-vertical:absolute;mso-position-vertical-relative:line;mso-left-percent:-10001;mso-top-percent:-10001;v-text-anchor:top" o:gfxdata="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" filled="f" stroked="f">
                 <o:lock v:ext="edit" aspectratio="t"/>
                 <w10:anchorlock/>
               </v:rect>
@@ -1520,7 +1520,7 @@
               <w:pStyle w:val="Contenudetableau"/>
             </w:pPr>
             <w:r>
-              <w:t>40</w:t>
+              <w:t>35</w:t>
             </w:r>
           </w:p>
         </w:tc>
@@ -1559,7 +1559,7 @@
               <w:pStyle w:val="Contenudetableau"/>
             </w:pPr>
             <w:r>
-              <w:t>25</w:t>
+              <w:t>30</w:t>
             </w:r>
           </w:p>
         </w:tc>

</xml_diff>